<commit_message>
Proofcheck Flour Play French: MINOR (20 fixes)
Co-Authored-By: Claude Opus 5.5 <noreply@anthropic.com>
Claude-Session: https://claude.ai/code/session_012Cm8JxdqzjuttdUSdkQCUg
</commit_message>
<xml_diff>
--- a/translated/corrected/Flour Play - ASSEMBLED - FORMATTED_French.docx
+++ b/translated/corrected/Flour Play - ASSEMBLED - FORMATTED_French.docx
@@ -188,7 +188,7 @@
     </w:p>
     <w:p>
       <w:r>
-        <w:t xml:space="preserve">« À peu près. »</w:t>
+        <w:t xml:space="preserve">« À très peu de choses près. »</w:t>
       </w:r>
     </w:p>
     <w:p>
@@ -295,7 +295,7 @@
     </w:p>
     <w:p>
       <w:r>
-        <w:t xml:space="preserve">Elle a posé sur la table, entre les pommes de pin et le ruban, une boîte à pâtisserie de la taille d’une boîte à chapeau, et a mis ses poings sur ses hanches pour nous toiser. Greta possédait la boulangerie Holly Jolly, plus bas sur l’avenue, et elle était bâtie comme ses beignets, ronde et saupoudrée de partout. Ce matin-là, son tablier était couvert de farine qu’elle n’avait pas pris la peine d’épousseter. </w:t>
+        <w:t xml:space="preserve">Elle a posé sur la table, entre les pommes de pin et le ruban, une boîte de boulangerie de la taille d’une boîte à chapeau, et a mis ses poings sur ses hanches pour nous toiser. Greta possédait la boulangerie Holly Jolly, plus bas sur l’avenue, et elle était bâtie comme ses beignets, ronde et saupoudrée de partout. Ce matin-là, son tablier était couvert de farine qu’elle n’avait pas pris la peine d’épousseter. </w:t>
       </w:r>
     </w:p>
     <w:p>
@@ -2592,7 +2592,7 @@
     </w:p>
     <w:p>
       <w:r>
-        <w:t xml:space="preserve">« Fissure dans le joint de carrelage à la base du mur du fond. Il faut refaire l’étanchéité. Espace sous la porte arrière où le bourrelet d’étanchéité est usé. Selon les textes, cela peut laisser passer des nuisibles. » Il a ouvert le robinet du lave-mains et y a plongé son thermomètre. « Et l’eau coule deux degrés en dessous de la norme. Matin froid, tuyau froid, je le sais. Mais c’est le chiffre. »</w:t>
+        <w:t xml:space="preserve">« Fissure dans le joint de carrelage à la base du mur du fond. Il faut refaire l’étanchéité. Espace sous la porte arrière où le bourrelet d’étanchéité est usé. Selon les textes, cela peut laisser passer des nuisibles. » Il a ouvert le robinet du lave-mains et y a plongé son thermomètre. « Et l’eau coule deux degrés sous la norme. Matin froid, tuyau froid, je le sais. Mais c’est le chiffre. »</w:t>
       </w:r>
     </w:p>
     <w:p>
@@ -3088,7 +3088,7 @@
     </w:p>
     <w:p>
       <w:r>
-        <w:t xml:space="preserve">« Je ne peux pas deviner les pensées des gens, Jessica. Je peux vous dire qu’un bac de bonne farine ne développe pas tout seul, du jour au lendemain, une base acide de boulangerie industrielle à dix fois le dosage par un quelconque accident voulu par Dieu ou la météo. » Il a refermé le bocal et me l’a repoussé doucement sur l’établi. « Quelqu’un a mis ça là. Et il savait exactement quelle quantité en mettre. »</w:t>
+        <w:t xml:space="preserve">« Je ne peux pas deviner les pensées des gens, Jessica. Je peux vous dire qu’un bac de bonne farine ne développe pas tout seul, du jour au lendemain, une base acide de boulangerie à pain à dix fois le dosage par un quelconque accident voulu par Dieu ou la météo. » Il a refermé le bocal et me l’a repoussé doucement sur l’établi. « Quelqu’un a mis ça là. Et il savait exactement quelle quantité en mettre. »</w:t>
       </w:r>
     </w:p>
     <w:p/>
@@ -3115,7 +3115,7 @@
     </w:p>
     <w:p>
       <w:r>
-        <w:t xml:space="preserve">Je n’y mettais pas de visage, bien que la ville l’eût fait. Mais le sol sous la question avait bougé pendant que je me tenais sur la marche du Doc. Ce qui était arrivé aux pâtisseries de Greta trouvait sa réponse dans un bocal de conserve niché dans mon manteau. Ce qu’il restait à déterminer, c’était qui, sur cette avenue, pouvait atteindre cette farine et connaissait le dosage exact pour la gâter.</w:t>
+        <w:t xml:space="preserve">Je n’y mettais pas de visage, bien que la ville l’eût fait. Mais le sol sous la question avait bougé pendant que je me tenais sur la marche du Doc. Ce qui était arrivé aux fournées de Greta trouvait sa réponse dans un bocal de conserve niché dans mon manteau. Ce qu’il restait à déterminer, c’était qui, sur cette avenue, pouvait atteindre cette farine et connaissait le dosage exact pour la gâter.</w:t>
       </w:r>
     </w:p>
     <w:p/>
@@ -3472,7 +3472,7 @@
     <w:p/>
     <w:p>
       <w:r>
-        <w:t xml:space="preserve">« Je ne vais pas vous retenir de travailler, ai-je dit. Je suis venue vous dire que je vous avais soupçonné. Pour l’histoire de Greta. Sur le simple fait que vous êtes dans cette cour avant l’aube et que personne d’autre n’a le droit d’y être. » J’avais trouvé préférable de jeter la chose laide en bloc à un homme et de le laisser la regarder. « Et je suis venue vous dire que je vous ai rayé de ma liste. Celui qui a fait ça avait besoin d’ un tempérament taillé pour l’obscurité et d’un métier de boulanger pour la poudre, et vous n’avez ni l’un ni l’autre. Vous vous disputez à midi, et vous coupez de la viande. Ça ne vous correspond pas. »</w:t>
+        <w:t xml:space="preserve">« Je ne vais pas vous retenir de travailler, ai-je dit. Je suis venue vous dire que je vous avais soupçonné. Pour l’histoire de Greta. Sur le simple fait que vous êtes dans cette cour avant l’aube et que personne d’autre n’a le droit d’y être. » J’avais trouvé préférable de jeter la chose laide en bloc à un homme et de le laisser la regarder. « Et je suis venue vous dire que je vous ai rayé de ma liste. Celui qui a fait ça avait besoin d’un tempérament taillé pour l’obscurité et d’un métier de boulanger pour la poudre, et vous n’avez ni l’un ni l’autre. Vous vous disputez à midi, et vous coupez de la viande. Ça ne vous correspond pas. »</w:t>
       </w:r>
     </w:p>
     <w:p/>
@@ -4602,7 +4602,7 @@
     <w:p/>
     <w:p>
       <w:r>
-        <w:t xml:space="preserve">« Je suis vétérinaire, Jessica, a-t-il dit quand j’ai eu fini. Je ne suis pas la police, et elle n’a rien à vous montrer. »</w:t>
+        <w:t xml:space="preserve">« Je suis vétérinaire, Jessica, a-t-il dit quand j’ai eu fini. Je ne suis pas la police, et elle n’est pas obligée de vous montrer quoi que ce soit. »</w:t>
       </w:r>
     </w:p>
     <w:p/>
@@ -4930,7 +4930,7 @@
     <w:p/>
     <w:p>
       <w:r>
-        <w:t xml:space="preserve">La boîte scellée trônait à sa place dans la pièce de devant, la fuite en était loin. Elle était en sûreté à deux bons mètres, par miracle. Mais un autre joint et une autre nuit de froid réduiraient cette distance à néant.</w:t>
+        <w:t xml:space="preserve">La boîte scellée trônait à sa place dans la pièce de devant, la fuite en était loin. Elle était en sûreté à près de deux mètres, par miracle. Mais un autre joint et une autre nuit de froid réduiraient cette distance à néant.</w:t>
       </w:r>
     </w:p>
     <w:p/>
@@ -5323,7 +5323,7 @@
     <w:p/>
     <w:p>
       <w:r>
-        <w:t xml:space="preserve">« Je n’ai jamais dit que je perdais la boule, a répliqué Martha. J’ai dit que c’était curieux. » Elle a tourné le téléphone vers moi pour que je puisse voir le journal des appels qui s’affichait sur l’écran lumineux. « Une femme m’a appelée hier soir, à l’heure du souper. Aimable. Professionnelle. Elle a dit qu’elle appelait de la boulangerie Wendt là-bas à Bridgton, et que le Holly Jolly étant fermé, ils se feraient un plaisir de prendre ma commande pour le Holly Jolly. Deux tartes chocolat-pécan et une douzaine de petits pains, prêts le mercredi avant Thanksgiving. » Elle a baissé le téléphone. « C’est ma commande. Au petit pain près. »</w:t>
+        <w:t xml:space="preserve">« Je n’ai jamais dit que je perdais la boule, a répliqué Martha. J’ai dit que c’était curieux. » Elle a tourné le téléphone vers moi pour que je puisse voir le journal des appels qui s’affichait sur l’écran lumineux. « Une femme m’a appelée hier soir, à l’heure du souper. Aimable. Professionnelle. Elle a dit qu’elle appelait de Wendt’s Bakehouse, là-bas à Bridgton, et que le Holly Jolly étant fermé, ils se feraient un plaisir de prendre ma commande pour le Holly Jolly. Deux tartes chocolat-pécan et une douzaine de petits pains, prêts le mercredi avant Thanksgiving. » Elle a baissé le téléphone. « C’est ma commande. Au petit pain près. »</w:t>
       </w:r>
     </w:p>
     <w:p/>
@@ -5353,7 +5353,7 @@
     <w:p/>
     <w:p>
       <w:r>
-        <w:t xml:space="preserve">« Et elle nous aurait appelées elle-même, a soutenu Martha. Elle m’a appelée en octobre pour s’assurer que je voulais les petits pains et non le pain. Elle ne refile pas ses clients à n’importe qui. »</w:t>
+        <w:t xml:space="preserve">« Et elle nous aurait appelées elle-même, a soutenu Martha. Elle m’a appelée en octobre pour s’assurer que je voulais les petits pains et non le pain. Elle ne refile ses clients à personne. »</w:t>
       </w:r>
     </w:p>
     <w:p/>
@@ -5593,7 +5593,7 @@
     <w:p/>
     <w:p>
       <w:r>
-        <w:t xml:space="preserve">« Que nous étions trop vieilles pour continuer. » Elle s’est arrêtée et a avalé sa salive avant de pouvoir poursuivre. « Elle m’a apporté un gratin de nouilles au thon lundi. Celles de sa mère. Avec des petits pois dedans, et des chips écrasées sur le dessus. Je n’en avais pas goûté depuis qu’elle était partie. Je suis restée plantée là juste après son départ et j’en ai mangé la moitié à même le plat en pleurant dedans comme une idiote, et je l’ai lavé hier soir pour le poser près de la porte et le lui rapporter. » Elle n’a pas regardé le plat. « J’allais l’apporter moi-même à Bridgton en voiture. J’allais frapper à sa porte. »</w:t>
+        <w:t xml:space="preserve">« Que nous étions trop vieilles pour faire durer la brouille. » Elle s’est arrêtée et a avalé sa salive avant de pouvoir poursuivre. « Elle m’a apporté un gratin de nouilles au thon lundi. Celles de sa mère. Avec des petits pois dedans, et des chips écrasées sur le dessus. Je n’en avais pas goûté depuis qu’elle était partie. Je suis restée plantée là juste après son départ et j’en ai mangé la moitié à même le plat en pleurant dedans comme une idiote, et je l’ai lavé hier soir pour le poser près de la porte et le lui rapporter. » Elle n’a pas regardé le plat. « J’allais l’apporter moi-même à Bridgton en voiture. J’allais frapper à sa porte. »</w:t>
       </w:r>
     </w:p>
     <w:p/>
@@ -5653,7 +5653,7 @@
     <w:p/>
     <w:p>
       <w:r>
-        <w:t xml:space="preserve">« Je ne sais pas encore, ai-je répondu. Je le saurai. Je ne viendrai pas te voir tant que je ne serai pas fixée. »</w:t>
+        <w:t xml:space="preserve">« Je ne sais pas encore, ai-je répondu. Je le saurai. Je ne t’en parlerai pas tant que je n’en serai pas sûre. »</w:t>
       </w:r>
     </w:p>
     <w:p/>
@@ -6173,7 +6173,7 @@
     </w:p>
     <w:p>
       <w:r>
-        <w:t xml:space="preserve">Et j’avais déjà été sûre de moi. Il y a trois jours, j’étais entrée au Sugarplum convaincue de la culpabilité de la mauvaise femme, avec un dossier que j’avais bâti moi-même et vérifié auprès de personne. Si j’avais prononcé le nom de Renée dans une salle cette semaine-là, il n’y aurait pas eu de retour en arrière possible.</w:t>
+        <w:t xml:space="preserve">Et j’avais déjà été sûre de moi. Il y a trois jours, j’étais entrée au Sugarplum convaincue de la culpabilité de la mauvaise femme, avec un dossier que j’avais bâti moi-même et que je n’avais vérifié auprès de personne. Si j’avais prononcé le nom de Renée dans une salle cette semaine-là, il n’y aurait pas eu de retour en arrière possible.</w:t>
       </w:r>
     </w:p>
     <w:p>
@@ -6713,7 +6713,7 @@
     <w:p/>
     <w:p>
       <w:r>
-        <w:t xml:space="preserve">« Je t’ai laissée partir, a fini par dire Greta, et la rudesse avait déserté sa voix. C’est vrai. Je te l’accorde. On s’est disputées pour les fours, on s’est disputées pour l’enseigne, on s’est disputées pour l’ouverture le dimanche, et quand tu as dit que tu voulais t’en aller, j’ai été soulagée — que Dieu me pardonne —, j’étais soulagée d’avoir une seule cuisine et une seule façon d’y faire les choses. J’aurais dû me battre pour que tu restes. Je ne l’ai pas fait. Ça, c’est ma faute. » Elle a pris une inspiration. « Et la fiche, c’est Theo qui me demandait quelque chose à y mettre, et moi qui l’ai griffonnée au comptoir entre deux clients, sans penser à mal. Je n’ai pas pensé à toi. Ça aussi, c’est ma faute. »</w:t>
+        <w:t xml:space="preserve">« Je t’ai laissée partir, a fini par dire Greta, et la rudesse avait déserté sa voix. C’est vrai. Je te l’accorde. On s’est disputées pour les fours, on s’est disputées pour l’enseigne, on s’est disputées pour l’ouverture le dimanche, et quand tu as dit que tu voulais t’en aller, j’ai été soulagée — que Dieu me pardonne —, j’étais soulagée d’avoir une seule cuisine et une seule façon d’y faire les choses. J’aurais dû me battre pour que tu restes. Je ne l’ai pas fait. Ça, c’est ma faute. » Elle a pris une inspiration. « Et la fiche, c’est Theo qui me demandait quelque chose à y mettre, et moi qui l’ai griffonnée au comptoir entre deux clients, sans réfléchir une seconde. Je n’ai pas pensé à toi. Ça aussi, c’est ma faute. »</w:t>
       </w:r>
     </w:p>
     <w:p/>
@@ -6797,7 +6797,7 @@
     <w:p/>
     <w:p>
       <w:r>
-        <w:t xml:space="preserve">« Vous allez avoir besoin d’un avocat à présent, madame Wendt, a-t-elle dit, non sans une certaine mansuétude. C’est votre droit, et à votre place, je ne manquerais pas d’en prendre un. Mais je vais être claire là-dessus, pour que personne n’ait d’illusions par la suite. Tout ce que j’ai entre les mains, c’est un bon de fournisseur portant votre signature, une analyse concordante d’un chimiste, un registre de l’État, un homme qui reconnaît votre camionnette, et deux femmes que votre boulangerie a appelées avec des commandes tirées d’un carnet que vous n’aviez pas à consulter. Tout est consigné par écrit. Rien de tout cela ne nécessite que vous passiez aux aveux. » Elle a posé le stylo. « Quels que soient vos remords cet après-midi — et je crois bien qu’il y en a —, cela ne changera pas un mot de ce qui est écrit. Vous serez inculpée aujourd’hui. Appelez votre avocat, revenez avec lui d’ici dix-huit heures, et nous réglerons le reste en toute discrétion. »</w:t>
+        <w:t xml:space="preserve">« Vous allez avoir besoin d’un avocat à présent, madame Wendt, a-t-elle dit, non sans une certaine mansuétude. C’est votre droit, et à votre place, je ne manquerais pas d’en prendre un. Mais je vais être claire là-dessus, pour que personne n’ait d’illusions par la suite. Ce que j’ai entre les mains, c’est un bon de fournisseur portant votre signature, une analyse concordante d’un chimiste, un registre de l’État, un homme qui reconnaît votre camionnette, et deux femmes que votre boulangerie a appelées avec des commandes tirées d’un carnet que vous n’aviez pas à consulter. Tout est consigné par écrit. Rien de tout cela ne nécessite que vous passiez aux aveux. » Elle a posé le stylo. « Quels que soient vos remords cet après-midi — et je crois bien qu’il y en a —, cela ne changera pas un mot de ce qui est écrit. Vous serez inculpée aujourd’hui. Appelez votre avocat, revenez avec lui d’ici dix-huit heures, et nous réglerons le reste en toute discrétion. »</w:t>
       </w:r>
     </w:p>
     <w:p/>
@@ -7173,7 +7173,7 @@
     <w:p/>
     <w:p>
       <w:r>
-        <w:t xml:space="preserve">Greta a fixé le papier un long moment, les mains jointes. Le précédent, venant du comté, était jaune. Puis elle a glissé la main sous sa vitrine, lui a coupé un coin de tarte chocolat-pécan, et le lui a mis dans la main. Il n’y avait rien à lui pardonner. Il n’était que le messager qu’on avait envoyé. Il l’a mangée en entier debout sur le seuil, le froid dans le dos, avant de s’en aller.</w:t>
+        <w:t xml:space="preserve">Greta a fixé le papier un long moment, les mains jointes. Le précédent, venant du comté, était jaune. Puis elle a glissé la main sous sa vitrine, lui a coupé un coin de tarte chocolat-pécan, et le lui a mis dans la main. Il n’y avait rien à lui pardonner. Il n’était que le messager qu’on avait envoyé. Il l’a mangé jusqu’à la dernière miette, debout sur le seuil, le froid dans le dos, avant de s’en aller.</w:t>
       </w:r>
     </w:p>
     <w:p/>
@@ -7185,7 +7185,7 @@
     <w:p/>
     <w:p>
       <w:r>
-        <w:t xml:space="preserve">La nouvelle a fait le tour de Frost Falls dès midi aussi vite que le doute l’avait fait, mais cette fois-ci, elle circulait dans une atmosphère chaleureuse. Ce n’était pas sa farine. Ça ne l’avait jamais été. C’était Joyce Wendt, venue de Bridgton, son ancienne associée, celle qui apportait le pain à la Grange. Elle avait gâché la farine exprès et menti au comté pour la faire fermer, et Mme Claus l’avait piégée avec un manchot. Ce dernier détail s’est un peu amplifié au fil des récits, et je l’ai laissé faire. Quand l’histoire est arrivée au bout d’Evergreen, Pip accomplissait des exploits que je n’aurais jamais crus possibles.</w:t>
+        <w:t xml:space="preserve">La nouvelle a fait le tour de Frost Falls dès midi aussi vite que le doute l’avait fait, mais cette fois-ci, elle circulait dans une atmosphère chaleureuse. Ce n’était pas sa farine. Ça ne l’avait jamais été. C’était Joyce Wendt, venue de Bridgton, son ancienne associée, celle qui apportait le pain à la Grange. Elle avait aigri la farine exprès et menti au comté pour la faire fermer, et Mme Claus l’avait piégée avec un manchot. Ce dernier détail s’est un peu amplifié au fil des récits, et je l’ai laissé faire. Quand l’histoire est arrivée au bout d’Evergreen, Pip accomplissait des exploits que je n’aurais jamais crus possibles.</w:t>
       </w:r>
     </w:p>
     <w:p/>
@@ -7197,7 +7197,7 @@
     <w:p/>
     <w:p>
       <w:r>
-        <w:t xml:space="preserve">Ici, les gens apportent de la soupe dans une maison frappée par la maladie. Comme il ne restait plus aucun malade à nourrir, ils ont dévalisé ses étagères à la place. À deux heures, la file sortait du Holly Jolly et descendait à moitié la rue, en piétinant dans le froid. Greta avait allumé tous ses fours, et la buée couvrait la vitre si épais qu’on ne pouvait plus lire HOLLY JOLLY au travers depuis la rue. Les petits pains au cacao étaient partis dès deux heures et demie. Les biscuits au gingembre avaient atteint le fond du bocal. Elle a lancé une fournée de brioches à la cannelle à trois heures, alors qu’elle n’avait aucune raison de le faire si tard, et elle a tout vendu chaud et sans glaçage, avant même qu’elles n’aient eu le temps de refroidir.</w:t>
+        <w:t xml:space="preserve">Ici, les gens apportent de la soupe dans une maison frappée par la maladie. Comme il ne restait plus aucun malade à nourrir, ils ont dévalisé ses étagères à la place. À deux heures, la file sortait du Holly Jolly et descendait à moitié la rue, en piétinant dans le froid. Greta avait allumé tous ses fours, et la buée était si épaisse sur la vitre qu’on ne pouvait plus lire HOLLY JOLLY au travers depuis la rue. Les petits pains au cacao étaient partis dès deux heures et demie. Les biscuits au gingembre avaient atteint le fond du bocal. Elle a lancé une fournée de brioches à la cannelle à trois heures, alors qu’elle n’avait aucune raison de le faire si tard, et elle a tout vendu chaud et sans glaçage, avant même qu’elles n’aient eu le temps de refroidir.</w:t>
       </w:r>
     </w:p>
     <w:p/>
@@ -7233,7 +7233,7 @@
     <w:p/>
     <w:p>
       <w:r>
-        <w:t xml:space="preserve">Le commerce de Noël que Joyce Wendt avait tenté de s’accaparer à Bridgton s’est engouffré par la porte de Greta à la place, en un seul après-midi, pour remplir la caisse de la femme qu’elle avait cherché à détrousser.</w:t>
+        <w:t xml:space="preserve">Le commerce de Noël que Joyce Wendt avait tenté d’emporter à Bridgton s’est engouffré par la porte de Greta à la place, en un seul après-midi, pour remplir la caisse de la femme qu’elle avait cherché à détrousser.</w:t>
       </w:r>
     </w:p>
     <w:p/>
@@ -7914,7 +7914,7 @@
     <w:p/>
     <w:p>
       <w:r>
-        <w:t xml:space="preserve">Martha m’a interceptée sur le trottoir, Snowball piaffant à sa cheville et Emma Redfern dévalant les marches du perron derrière elle, les joues rougies par le froid et la course.</w:t>
+        <w:t xml:space="preserve">Martha m’a interceptée sur le trottoir, Snowball piaffant à sa cheville et Emma Redfern dévalant les marches du porche derrière elle, les joues rougies par le froid et la course.</w:t>
       </w:r>
     </w:p>
     <w:p/>

</xml_diff>

<commit_message>
Full proofcheck Flour Play French: SIGNIFICANT (44 fixes)
Co-Authored-By: Claude Opus 5.5 <noreply@anthropic.com>
Claude-Session: https://claude.ai/code/session_012Cm8JxdqzjuttdUSdkQCUg
</commit_message>
<xml_diff>
--- a/translated/corrected/Flour Play - ASSEMBLED - FORMATTED_French.docx
+++ b/translated/corrected/Flour Play - ASSEMBLED - FORMATTED_French.docx
@@ -625,7 +625,7 @@
     </w:p>
     <w:p>
       <w:r>
-        <w:t xml:space="preserve">« Et Noël juste après, a ajouté Greta. Ces six prochaines semaines représentent toute mon année, Jessica. C’est l’argent qui me porte jusqu’au printemps. » Elle a posé sa main à plat sur le livre ouvert. « C’est pour ça que j’ai déchiré la lettre de cet avocat en août. Une boîte qui voulait me racheter, corps et biens. Je n’en avais même jamais entendu parler. »</w:t>
+        <w:t xml:space="preserve">« Et Noël juste après, a ajouté Greta. Ces six prochaines semaines représentent toute mon année, Jessica. C’est l’argent qui me porte jusqu’au printemps. » Elle a posé sa main à plat sur le livre ouvert. « C’est pour ça que j’ai déchiré la lettre de cet avocat en août. Une boîte qui voulait me racheter corps, biens et enseigne. Je n’en avais même jamais entendu parler. »</w:t>
       </w:r>
     </w:p>
     <w:p/>
@@ -816,13 +816,13 @@
     <w:p/>
     <w:p>
       <w:r>
-        <w:t xml:space="preserve">« Nous nous en sommes sorties, ai-je dit. »</w:t>
-      </w:r>
-    </w:p>
-    <w:p/>
-    <w:p>
-      <w:r>
-        <w:t xml:space="preserve">« Oh, je suis sûre que vous vous en êtes sorties. » Elle a ri et a touché ma manche, qualifiant ce mot d’un ton à la fois aimable et condescendant. « Vous avez déjà une boulangerie, je le sais. Celle avec… » Elle a hésité, cherchant ses mots. « Le style campagnard. Des petits pains et tout le reste. On me dit que c’est une institution. » Autre hésitation, si légère que j’aurais pu l’imaginer. « Pauvre femme. Quel dommage pour ses tracas du moment. »</w:t>
+        <w:t xml:space="preserve">« Nous nous en sommes sortis, ai-je dit. »</w:t>
+      </w:r>
+    </w:p>
+    <w:p/>
+    <w:p>
+      <w:r>
+        <w:t xml:space="preserve">« Oh, je suis sûre que vous vous en êtes sortis. » Elle a ri et a touché ma manche, qualifiant ce mot d’un ton à la fois aimable et condescendant. « Vous avez déjà une boulangerie, je le sais. Celle avec… » Elle a hésité, cherchant ses mots. « Le style campagnard. Des petits pains et tout le reste. On me dit que c’est une institution. » Autre hésitation, si légère que j’aurais pu l’imaginer. « Pauvre femme. Quel dommage pour ses tracas du moment. »</w:t>
       </w:r>
     </w:p>
     <w:p/>
@@ -834,7 +834,7 @@
     <w:p/>
     <w:p>
       <w:r>
-        <w:t xml:space="preserve">« Rien que ce qu’on entend. » Renée a écarté ses mains fraîches, tout en affichant sa sympathie. « Sa porte est fermée toute la matinée, et les livreurs de pain racontent qu’elle traverse une mauvaise passe. Des fournées qui tournent mal, ce genre de désagréments. Je la plains sincèrement. » Elle a secoué la tête. « Quoique, je vous le dis, dans ce milieu, dès qu’une cuisine a mauvaise réputation » — elle m’a regardée, franche et pleine de regrets, telle une professionnelle se confiant à une amie —, « les gens finissent par parler, n’est-ce pas ? Ce n’est pas juste, mais c’est ainsi. Une boulangerie vit de son nom. Laissez entrer le doute et c’est le diable pour le faire ressortir. » Elle a souri. « Mais écoutez-moi, à parler boutique alors que vous êtes juste venue dire bonjour. Entrez. Je veux que vous voyiez les fours. »</w:t>
+        <w:t xml:space="preserve">« Rien que ce qu’on entend. » Renée a écarté ses mains fraîches, tout en affichant sa sympathie. « Sa porte est restée fermée toute la matinée, et les livreurs de pain racontent qu’elle traverse une mauvaise passe. Des fournées qui tournent mal, ce genre de désagréments. Je la plains sincèrement. » Elle a secoué la tête. « Quoique, je vous le dis, dans ce milieu, dès qu’une cuisine a mauvaise réputation » — elle m’a regardée, franche et pleine de regrets, telle une professionnelle se confiant à une amie —, « les gens finissent par parler, n’est-ce pas ? Ce n’est pas juste, mais c’est ainsi. Une boulangerie vit de son nom. Laissez entrer le doute et c’est le diable pour le faire ressortir. » Elle a souri. « Mais écoutez-moi, à parler boutique alors que vous êtes juste venue dire bonjour. Entrez. Je veux que vous voyiez les fours. »</w:t>
       </w:r>
     </w:p>
     <w:p/>
@@ -846,7 +846,7 @@
     <w:p/>
     <w:p>
       <w:r>
-        <w:t xml:space="preserve">Pip s’est installée sur la marche pour attendre, l’œil toujours rivé sur les lettres dorées. Renée m’a tenu la porte, et je suis entrée. Je voulais voir la cuisine moi aussi, bien que pour aucune des raisons que je lui avais données.</w:t>
+        <w:t xml:space="preserve">Pip s’est installée sur la marche pour attendre, l’œil toujours rivé sur les lettres dorées. Renée m’a tenu la porte, et je suis entrée. Je voulais voir la cuisine moi aussi, mais pour des raisons que je ne lui ai pas dites.</w:t>
       </w:r>
     </w:p>
     <w:p/>
@@ -960,7 +960,7 @@
     <w:p/>
     <w:p>
       <w:r>
-        <w:t xml:space="preserve">Hal s’est redessé en s’écartant du comptoir et a tourné sa feuille de papier pour que je puisse lire, avec le plaisir timide d’un homme minutieux qui montre quelque chose sur lequel il a mûrement réfléchi. Hal tenait l’épicerie Frosty’s à l’extrémité proche de l’avenue, et c’était l’âme la plus méthodique de Frost Falls. Ses boîtes de conserve faisaient face vers l’avant et ses pommes reposaient la queue vers le haut dans le bac.</w:t>
+        <w:t xml:space="preserve">Hal s’est redressé en s’écartant du comptoir et a tourné sa feuille de papier pour que je puisse lire, avec le plaisir timide d’un homme minutieux qui montre quelque chose sur lequel il a mûrement réfléchi. Hal tenait l’épicerie Frosty’s à l’extrémité proche de l’avenue, et c’était l’âme la plus méthodique de Frost Falls. Ses boîtes de conserve faisaient face vers l’avant et ses pommes reposaient la queue vers le haut dans le bac.</w:t>
       </w:r>
     </w:p>
     <w:p/>
@@ -1231,7 +1231,7 @@
     </w:p>
     <w:p>
       <w:r>
-        <w:t xml:space="preserve">« Je ne sais rien pour l’instant, ai-je répondu », ce qui était vrai, et difficile à admettre. « Mais voici ce que je vais faire, et tu peux me prendre au mot. Je vais découvrir la vérité. Pas ce que j’aimerais qu’elle soit, ni ce qui arrange les choses, mais la pure vérité, de haut en bas. Quelqu’un t’a fait ça exprès. » J’ai serré sa main froide entre mes deux mains. « Tu gardes la tête haute, tu laisses les gens t’aider, et tu me laisses le reste. Quelqu’un veut que Frost Falls cesse de faire confiance au Holly Jolly. Je vais découvrir pourquoi, puis qui, et ensuite nous ferons en sorte qu’ils regrettent amèrement d’avoir choisi mon avenue pour chercher noise. »</w:t>
+        <w:t xml:space="preserve">« Je ne sais rien pour l’instant, ai-je répondu », ce qui était vrai, et difficile à admettre. « Mais voici ce que je vais faire, et tu peux me prendre au mot. Je vais découvrir la vérité. Pas qui j’aimerais que ce soit, ni ce qui arrange les choses, mais la pure vérité, de haut en bas. Quelqu’un t’a fait ça exprès. » J’ai serré sa main froide entre mes deux mains. « Tu gardes la tête haute, tu laisses les gens t’aider, et tu me laisses le reste. Quelqu’un veut que Frost Falls cesse de faire confiance au Holly Jolly. Je vais découvrir pourquoi, puis qui, et ensuite nous ferons en sorte qu’ils regrettent amèrement d’avoir choisi mon avenue pour chercher noise. »</w:t>
       </w:r>
     </w:p>
     <w:p>
@@ -1432,7 +1432,7 @@
     <w:p/>
     <w:p>
       <w:r>
-        <w:t xml:space="preserve">Je me suis assise sur la chaise qu’elles m’avaient gardée, au chaud, au milieu du cercle, et non au bout glacial près de la porte. Olivia m’a posé un cadre neuf sur les genoux et une poignée de sapin baumier à côté sans qu’il soit besoin de le lui demander. Je me suis mise à disposer les brins, l’un par-dessus l’autre, tous tournés vers l’intérieur, et j’ai écouté.</w:t>
+        <w:t xml:space="preserve">Je me suis assise sur la chaise qu’elles m’avaient gardée, au chaud, au milieu du cercle, et non au bout glacial près de la porte. Olivia m’a posé un cadre neuf sur les genoux et une poignée de sapin baumier à côté sans qu’il soit besoin de le lui demander. Je me suis mise à disposer les brins, l’un par-dessus l’autre, tous orientés vers la maison, et j’ai écouté.</w:t>
       </w:r>
     </w:p>
     <w:p/>
@@ -1666,7 +1666,7 @@
     <w:p/>
     <w:p>
       <w:r>
-        <w:t xml:space="preserve">« J’ai déjà nommé des gens avec moins d’éléments que ça, ai-je rétorqué, et je me suis trompée, et j’ai dû continuer à habiter dans la même rue qu’eux après. » J’ai levé ma couronne achevée, chaque brin pointant vers le centre. « Greta mérite mieux que des suppositions de ma part. Elle le mérite de nous toutes. »</w:t>
+        <w:t xml:space="preserve">« J’ai déjà nommé des gens avec moins d’éléments que ça, ai-je rétorqué, et je me suis trompée, et j’ai dû continuer à habiter dans la même rue qu’eux après. » J’ai levé ma couronne achevée, chaque brin orienté vers la maison. « Greta mérite mieux que des suppositions de ma part. Elle le mérite de nous toutes. »</w:t>
       </w:r>
     </w:p>
     <w:p/>
@@ -1702,7 +1702,7 @@
     <w:p/>
     <w:p>
       <w:r>
-        <w:t xml:space="preserve">Emma a traversé la pièce, s’est accroupie près du nid sans se jeter dessus, car elle avait de l’éducation. Pip l’a autorisée à lui passer deux fois la main sur le dos avec précaution, suivis d’un entretien chuchoté auquel je n’ai pas assisté. Snowball s’est éveillé pour venir s’appuyer contre le genou d’Emma, jaloux, et Martha a laissé échapper son petit rire étouffé en regardant le duo.</w:t>
+        <w:t xml:space="preserve">Emma a traversé la pièce, s’est accroupie près du nid sans se jeter dessus, car elle avait de l’éducation. Pip l’a autorisée à lui passer deux fois la main sur le dos avec précaution, puis lui a accordé un entretien chuchoté auquel je n’ai pas assisté. Snowball s’est éveillé pour venir s’appuyer contre le genou d’Emma, jaloux, et Martha a laissé échapper son petit rire étouffé en regardant le duo.</w:t>
       </w:r>
     </w:p>
     <w:p/>
@@ -1987,7 +1987,7 @@
         <w:t xml:space="preserve">Frost Falls n’a pas été bâtie par les forts. Elle a été bâtie par les bons voisins.</w:t>
       </w:r>
       <w:r>
-        <w:t xml:space="preserve"> Les gens l’ont découpé. Kelly a épinglé le sien derrière le comptoir du Starlight près de la caisse, où chaque âme qui achetait un café le lisait, pour la plupart à haute voix, et se taisait un instant après. Greta, lorsque je lui ai apporté la coupure dans sa boutique fermée, l’a lue deux fois, tout comme je l’avais fait. Elle a serré les lèvres très fort. « Eh bien, a-t-elle dit. » Rien de plus, de la voix d’une femme à qui l’on rappelle quelque chose à l’heure exacte où elle en avait le plus besoin. Puis elle l’a épinglé à l’intérieur de sa vitrine sombre, tourné vers l’extérieur. Là où le mot SALE avait été effacé du bardage peu de temps auparavant.</w:t>
+        <w:t xml:space="preserve"> Les gens l’ont découpé. Kelly a épinglé le sien derrière le comptoir du Starlight près de la caisse, où chaque âme qui achetait un café le lisait, pour la plupart à haute voix, et se taisait un instant après. Greta, lorsque je lui ai apporté la coupure dans sa boutique fermée, l’a lue deux fois, tout comme je l’avais fait. Elle a serré les lèvres très fort. « Eh bien, a-t-elle dit. » Rien de plus, de la voix d’une femme à qui l’on rappelle quelque chose à l’heure exacte où elle en avait le plus besoin. Puis elle l’a scotchée à l’intérieur de sa vitrine sombre, tournée vers l’extérieur. Là où le mot SALE avait été effacé du bardage peu de temps auparavant.</w:t>
       </w:r>
     </w:p>
     <w:p/>
@@ -2348,7 +2348,7 @@
     </w:p>
     <w:p>
       <w:r>
-        <w:t xml:space="preserve">Le fait qu’il n’avait pas dégelé d’un seul degré depuis Halloween a pu passer inaperçu.</w:t>
+        <w:t xml:space="preserve">Personne n’a relevé qu’il n’avait pas dégelé d’un seul degré depuis Halloween.</w:t>
       </w:r>
     </w:p>
     <w:p>
@@ -2373,7 +2373,7 @@
     </w:p>
     <w:p>
       <w:r>
-        <w:t xml:space="preserve">Et en comptant, je l’ai trouvée. Ils n’étaient pas tous penchés du même côté.</w:t>
+        <w:t xml:space="preserve">Et en comptant, je l’ai remarqué. Ils n’étaient pas tous penchés du même côté.</w:t>
       </w:r>
     </w:p>
     <w:p>
@@ -2445,7 +2445,7 @@
     </w:p>
     <w:p>
       <w:r>
-        <w:t xml:space="preserve">« C’est le foyer que je lui construis, pour qu’il arrête d’emprunter les bonhommes de neige. » Un sourire fatigué, sincère. « Ce n’est pas prêt. Il faudra des années pour que tout soit achevé. Mais c’est un début, et d’ici là, ça continuera à dorer une bougie et à promener les bonhommes de neige des enfants dans le noir, parce que ça veut être ici et que ça n’a pas de jambes à soi. Bram est hors de lui. Trouve cela indigne, la magie qui fait des tours en public là où la ville peut voir. Il l’enfermerait bien dans le paddock avec les rennes s’il le pouvait, sans plus de chances de la retenir. »</w:t>
+        <w:t xml:space="preserve">« C’est le foyer que je lui construis, pour que ça arrête d’emprunter les bonhommes de neige. » Un sourire fatigué, sincère. « Ce n’est pas prêt. Il faudra des années pour que tout soit achevé. Mais c’est un début, et d’ici là, ça continuera à dorer une bougie et à promener les bonhommes de neige des enfants dans le noir, parce que ça veut être ici et que ça n’a pas de jambes à soi. Bram est hors de lui. Trouve cela indigne, la magie qui fait des tours en public là où la ville peut voir. Il l’enfermerait bien dans le paddock avec les rennes s’il le pouvait, sans plus de chances de la retenir. »</w:t>
       </w:r>
     </w:p>
     <w:p>
@@ -2744,7 +2744,7 @@
     </w:p>
     <w:p>
       <w:r>
-        <w:t xml:space="preserve">Mais je suis restée dans le froid à observer l’autre chose se produire également, petite et silencieuse sous les élans de soutien. Un homme que je connaissais à peine s’est arrêté devant la vitrine avec son garçon, l’a lue, et l’a entraîné plus loin. Pas méchamment. Juste avec précaution. Une femme a murmuré à une autre, à voix basse, ignorant que j’étais tout près : « Enfin, ils ne vous ferment pas pour rien, si ? » et l’autre a répondu : « Non, je suppose que non. » Aucune d’elles ne souhaitait le moindre mal à Greta, et toutes deux, sans se rendre compte de ce qu’elles venaient de faire, l’avaient, dans leur esprit, éloignée encore un peu plus de la sécurité. C’était cela l’arme. La fermeture serait levée et le papier jaune finirait par disparaître, mais pas le doute. Le sceau du comté permettait à une personne convenable et pleine de doutes de dire qu’il n’y a pas de fumée sans feu tout en ayant l’air raisonnable en le disant. Tom pouvait effacer un mot sur un mur. Personne ne pouvait effacer un sceau officiel. Il s’était faufilé à l’intérieur, et il y restait, dans le seul endroit où une boulangerie préservait toute son existence : la confiance des gens qui mangent son pain.</w:t>
+        <w:t xml:space="preserve">Mais je suis restée dans le froid à observer l’autre chose se produire également, petite et silencieuse sous les élans de soutien. Un homme que je connaissais à peine s’est arrêté devant la vitrine avec son garçon, a lu l’avis, et l’a entraîné plus loin. Pas méchamment. Juste avec précaution. Une femme a murmuré à une autre, à voix basse, ignorant que j’étais tout près : « Enfin, ils ne vous ferment pas pour rien, si ? » et l’autre a répondu : « Non, je suppose que non. » Aucune d’elles ne souhaitait le moindre mal à Greta, et toutes deux, sans se rendre compte de ce qu’elles venaient de faire, l’avaient, dans leur esprit, éloignée encore un peu plus de la sécurité. C’était cela l’arme. La fermeture serait levée et le papier jaune finirait par disparaître, mais pas le doute. Le sceau du comté permettait à une personne convenable et pleine de doutes de dire qu’il n’y a pas de fumée sans feu tout en ayant l’air raisonnable en le disant. Tom pouvait effacer un mot sur un mur. Personne ne pouvait effacer un sceau officiel. Il s’était faufilé à l’intérieur, et il y restait, dans le seul endroit où une boulangerie préservait toute son existence : la confiance des gens qui mangent son pain.</w:t>
       </w:r>
     </w:p>
     <w:p>
@@ -2983,7 +2983,7 @@
     <w:p/>
     <w:p>
       <w:r>
-        <w:t xml:space="preserve">« C’est exact. » Je me suis refusée à faire le dernier pas là-bas, dans l’odeur chaleureuse de chez Frosty alors que le tonneau se remplissait près de la porte, car j’avais déjà prononcé des noms trop vite auparavant, et je l’avais payé cher dans des bourgades que j’avais dû quitter. Mais le terrain s’était resserré sous mes pas pendant que je restais immobile. Pas un gamin muni d’une bombe de peinture. Pas un boucher qui vous invective au visage. Pas un père de famille comptant ses dernières bûches. Quelqu’un qui exerce un métier manuel et dispose de fournisseurs, avec un motif pour vouloir éteindre la plus ancienne boulangerie de l’avenue avant Noël.</w:t>
+        <w:t xml:space="preserve">« C’est exact. » Je me suis refusée à faire le dernier pas là-bas, dans l’odeur chaleureuse de chez Frosty alors que le tonneau se remplissait près de la porte, car j’avais déjà prononcé des noms trop vite auparavant, et je l’avais payé cher dans des bourgades que je ne pouvais pas quitter. Mais le terrain s’était resserré sous mes pas pendant que je restais immobile. Pas un gamin muni d’une bombe de peinture. Pas un boucher qui vous invective au visage. Pas un père de famille comptant ses dernières bûches. Quelqu’un qui exerce un métier manuel et dispose de fournisseurs, avec un motif pour vouloir éteindre la plus ancienne boulangerie de l’avenue avant Noël.</w:t>
       </w:r>
     </w:p>
     <w:p/>
@@ -3173,7 +3173,7 @@
     <w:p/>
     <w:p>
       <w:r>
-        <w:t xml:space="preserve">La question avait changé de forme du jour au lendemain, telle une pierre qu’on garde trop longtemps en poche et qui s’arrondit, et au matin, elle s’était réduite à un seul mot implacable. L’accès. Doc avait fourni la réponse sur sa nature même, au fond de ses flacons bruns, et m’avait légué toute la question du coupable. Et le coupable commençait, comme toute recherche de ce genre, par une interrogation plus simple. Pas qui la détestait. Qui pouvait mettre la main sur sa farine.</w:t>
+        <w:t xml:space="preserve">La question avait changé de forme du jour au lendemain, telle une pierre qu’on garde trop longtemps en poche et qui s’arrondit, et au matin, elle s’était réduite à un seul mot implacable. L’accès. Doc avait fourni la réponse sur sa nature même, au fond de ses flacons bruns, et m’avait laissé tout entière la question de savoir qui. Et cette question-là commençait, comme toutes celles de ce genre, par une autre plus simple. Pas qui la détestait. Qui pouvait mettre la main sur sa farine.</w:t>
       </w:r>
     </w:p>
     <w:p/>
@@ -3233,13 +3233,13 @@
     <w:p/>
     <w:p>
       <w:r>
-        <w:t xml:space="preserve">Je me suis tenue devant la porte de service de Greta dans le froid et j’ai regardé ce qu’en verrait quiconque se trouvant là. Le seuil où arrivaient les sacs. La pénombre de l’arrière-boutique au-delà. Et à travers la pièce, petite et vive, au loin, la gueule de ses fours, là où elle devait se trouver. Une personne postée à ce seuil dans l’obscurité aurait eu tout le cœur chaleureux de sa boutique étalé comme une scène de théâtre, et elle-même se serait trouvée dans les coulisses où la lumière ne pénétrait pas. Elle l’aurait vue avant que Greta ne puisse l’apercevoir. Elle aurait entendu les ventilateurs en sachant que Greta ne pouvait l’entendre. Et elle aurait eu tout le temps nécessaire.</w:t>
-      </w:r>
-    </w:p>
-    <w:p/>
-    <w:p>
-      <w:r>
-        <w:t xml:space="preserve">Et c’était accessible. C’était bien là le problème. Pas un coffre-fort. Une porte en bois sur une ruelle publique qui était restée ouverte la moitié de chaque matinée jusqu’à la brique. Quiconque connaissait les horaires d’un boulanger et avait une raison de se trouver dans cette cour avant l’aube pouvait s’avancer sur ce seuil sans être repéré. Une cour aussi fréquentée, comme Pete l’avait dit lui-même, ne laissait voir que des empreintes et aucune réponse. La neige autour de la marche de Greta était piétinée en une boue regelée, empreinte de botte sur empreinte de botte, celle du chauffeur de livraison, la sienne, celle du chasse-neige et Dieu sait de qui d’autre. Une centaine de pas. Pas un seul nom.</w:t>
+        <w:t xml:space="preserve">Je me suis tenue devant la porte de service de Greta dans le froid et j’ai regardé ce qu’en verrait quiconque se trouvant là. Le seuil où arrivaient les sacs. La pénombre de l’arrière-boutique au-delà. Et à travers la pièce, petite et vive, au loin, la gueule de ses fours, là où elle devait se trouver. Quelqu’un posté à ce seuil dans l’obscurité aurait eu tout le cœur chaleureux de sa boutique étalé comme une scène de théâtre, et lui-même se serait trouvé dans les coulisses où la lumière ne pénétrait pas. Il l’aurait vue avant qu’elle ne puisse l’apercevoir. Il aurait entendu les ventilateurs en sachant qu’elle ne pouvait pas l’entendre. Et il aurait eu tout le temps nécessaire.</w:t>
+      </w:r>
+    </w:p>
+    <w:p/>
+    <w:p>
+      <w:r>
+        <w:t xml:space="preserve">Et c’était accessible. C’était bien là le problème. Pas un coffre-fort. Une porte en bois sur une ruelle publique qui était restée ouverte la moitié de chaque matinée jusqu’à la brique. Quiconque connaissait les horaires d’un boulanger et avait une raison de se trouver dans cette cour avant l’aube pouvait s’avancer sur ce seuil sans être repéré. Une cour aussi fréquentée, comme Pete l’avait dit lui-même, ne laissait voir que des empreintes et aucune réponse. La neige autour de la marche de Greta était piétinée en une boue regelée, empreinte de botte sur empreinte de botte, celle du chauffeur de livraison, la sienne, celle du chasse-neige et Dieu sait de qui d’autre. Une centaine d'empreintes. Pas un seul nom.</w:t>
       </w:r>
     </w:p>
     <w:p/>
@@ -3269,7 +3269,7 @@
     <w:p/>
     <w:p>
       <w:r>
-        <w:t xml:space="preserve">Parce qu’une fois que j’avais cherché qui pouvait atteindre la farine, il me fallait suivre la piste le long de ce quai piétiné. À trois portes de l’entrée ouverte de Greta se trouvait le seul homme qui rôdait dans cette cour avant l’aube, trois ou quatre matins par semaine.</w:t>
+        <w:t xml:space="preserve">Parce qu’une fois que j’avais cherché qui pouvait atteindre la farine, il me fallait suivre la piste le long de ce quai piétiné. À trois portes de l’entrée ouverte de Greta se trouvait le seul homme qui se trouvait dans cette cour avant l’aube, trois ou quatre matins par semaine.</w:t>
       </w:r>
     </w:p>
     <w:p/>
@@ -3401,7 +3401,7 @@
     <w:p/>
     <w:p>
       <w:r>
-        <w:t xml:space="preserve">J’ai trouvé cela délicat, un plat chaud apporté exprès de Bridgton pour une femme qui lui avait opposé une fin de non-recevoir la semaine précédente.</w:t>
+        <w:t xml:space="preserve">J’ai trouvé cela délicat, un plat chaud apporté exprès de Bridgton pour une femme qui ne lui avait adressé qu'un mot par-dessus le comptoir la semaine précédente.</w:t>
       </w:r>
     </w:p>
     <w:p/>
@@ -3603,7 +3603,7 @@
     </w:p>
     <w:p>
       <w:r>
-        <w:t xml:space="preserve">« Danny. » Elle a essuyé ses mains sur son tablier. « Ils racontent que c’était Danny. Je l’ai appris hier et je n’ai pas dormi depuis. » Elle a contourné le comptoir. « Jessica, j’ai congédié ce garçon pour la raison la plus simple au monde, et il n’y était pour rien. Les affaires ont été calmes cet automne, et je ne pouvais pas garder un garçon le week-end en le payant pendant cette période. Je l’ai fait asseoir et je lui ai parlé franchement, et je lui ai donné deux semaines de salaire qu’il n’avait pas travaillées et une boîte de pâtisseries de la veille pour sa mère, et il a pris tout ça en silence, honteux de l’eau dans ses yeux, parti avant que j’aie pu dire la moitié de ce que je voulais. » Sa voix s’est alourdie. « Un bon travailleur. Lent à démarrer mais régulier une fois lancé. Et maintenant ils l’accusent d’avoir peint SALE sur mon mur, et je n’arrive pas à faire correspondre cela avec le garçon qui alignait mes boîtes du matin au cordeau parce qu’il ne les supportait pas de travers. »</w:t>
+        <w:t xml:space="preserve">« Danny. » Elle a essuyé ses mains sur son tablier. « Ils racontent que c’était Danny. Je l’ai appris hier et je n’ai pas dormi depuis. » Elle a contourné le comptoir. « Jessica, j’ai congédié ce garçon pour la raison la plus simple au monde, et il n’y était pour rien. Les affaires ont été calmes cet automne, et je ne pouvais pas garder un garçon le week-end en le payant pendant cette période. Je l’ai fait asseoir et je lui ai parlé franchement, et je lui ai donné deux semaines de salaire qu’il n’avait pas travaillées et une boîte d'invendus de la veille pour sa mère, et il a pris tout ça en silence, honteux de l’eau dans ses yeux, parti avant que j’aie pu dire la moitié de ce que je voulais. » Sa voix s’est alourdie. « Un bon travailleur. Lent à démarrer mais régulier une fois lancé. Et maintenant ils l’accusent d’avoir peint SALE sur mon mur, et je n’arrive pas à faire correspondre cela avec le garçon qui alignait mes boîtes du matin au cordeau parce qu’il ne les supportait pas de travers. »</w:t>
       </w:r>
     </w:p>
     <w:p>
@@ -3908,7 +3908,7 @@
     <w:p/>
     <w:p>
       <w:r>
-        <w:t xml:space="preserve">Peu de temps après, une camionnette blanche a reculé contre la porte latérale de la Grange avec l’inscription WENDT’S BAKEHOUSE · BRIDGTON sur le flanc, et Joyce Wendt en est descendue, sa parka ouverte sur sa veste de boulangère. Elle est entrée avec une caisse de pain sur chaque hanche, les a posées près des tonneaux de Hal et est retournée en chercher d’autres avant que quiconque puisse demander ce que c’était.</w:t>
+        <w:t xml:space="preserve">Peu de temps après, une camionnette blanche a reculé contre la porte latérale de la Grange avec l’inscription WENDT’S BAKEHOUSE · BRIDGTON sur le flanc, et Joyce Wendt en est descendue, sa parka ouverte sur sa blouse de boulangère. Elle est entrée avec une caisse de pain sur chaque hanche, les a posées près des tonneaux de Hal et est retournée en chercher d’autres avant que quiconque puisse demander ce que c’était.</w:t>
       </w:r>
     </w:p>
     <w:p/>
@@ -4118,7 +4118,7 @@
     <w:p/>
     <w:p>
       <w:r>
-        <w:t>Et elle parlait boulange, comme toujours.</w:t>
+        <w:t>Et elle parlait boutique, comme toujours.</w:t>
       </w:r>
     </w:p>
     <w:p/>
@@ -4303,7 +4303,7 @@
     <w:p/>
     <w:p>
       <w:r>
-        <w:t xml:space="preserve">« Vous n’aurez pas vu un mois de décembre dans cette rue comme celui qui s’annonce, a-t-elle dit, l’air détendu, en posant la tasse devant moi. J’ai épluché les chiffres. La population, les soupers de l’église, l’école, tout le calendrier des fêtes que vous tenez. Il y a plus de pouvoir d’achat dans cette ville à Noël qu’elle n’en a jamais eu à dépenser nulle part ailleurs, parce qu’elle n’a toujours eu que la vieille boulangerie pour le dépenser. À des prix de campagne. Pour des produits de campagne. » Elle a prononcé « la vieille boulangerie » d’un ton aimable, nommant une chose déjà reléguée au passé. « Toute cette clientèle cherche où aller. Et me voilà. »</w:t>
+        <w:t xml:space="preserve">« Vous n’aurez pas vu un mois de décembre dans cette rue comme celui qui s’annonce, a-t-elle dit, l’air détendu, en posant la tasse devant moi. J’ai épluché les chiffres. La population, les soupers de l’église, l’école, tout le calendrier des fêtes que vous tenez. Il y a plus d’argent à dépenser en douceurs dans cette ville à Noël qu’elle n’a jamais eu d’endroits où le dépenser, parce qu’elle n’a toujours eu que la vieille boulangerie pour cela. À des prix de campagne. Pour des produits de campagne. » Elle a prononcé « la vieille boulangerie » d’un ton aimable, nommant une chose déjà reléguée au passé. « Toute cette clientèle cherche où aller. Et me voilà. »</w:t>
       </w:r>
     </w:p>
     <w:p/>
@@ -4327,7 +4327,7 @@
     <w:p/>
     <w:p>
       <w:r>
-        <w:t xml:space="preserve">Les joints. Les bourrelets d’étanchéité. Le lave-mains à deux degrés sous la norme à cause d’un vieux tuyau. Elle avait nommé les trois dans l’ordre, avec le jargon du métier, exactement comme Varney les avait égrenés de sa liste. Exactement comme la plainte dactylographiée l’avait fait avant même qu’un homme ne mette les pieds chez Greta.</w:t>
+        <w:t xml:space="preserve">Les joints. Les bourrelets d’étanchéité. Le lave-mains à deux degrés sous la norme à cause d’un vieux tuyau. Elle avait nommé les trois dans l’ordre, avec le jargon du métier, exactement comme Varney les avait égrenés de sa liste. Exactement comme la plainte dactylographiée l’avait fait avant même que cet homme ne mette les pieds chez Greta.</w:t>
       </w:r>
     </w:p>
     <w:p/>
@@ -5119,7 +5119,7 @@
     </w:p>
     <w:p>
       <w:r>
-        <w:t xml:space="preserve">« Celle ou celui qui a lancé cette brique n’avait rien d’énervé. Elle a traversé les lettres dorées du nom de Greta une nuit où il n’y avait pas un chat dans la rue. Et Renée m’a fait asseoir pour me compter les soupers paroissiaux de cette ville. Elle ne prend pas ce qui traîne. »</w:t>
+        <w:t xml:space="preserve">« Quiconque a lancé cette brique n’était pas en colère. La brique a traversé les lettres dorées du nom de Greta une nuit où il n’y avait pas un chat dans la rue. Et Renée m’a fait asseoir pour me compter les soupers paroissiaux de cette ville. Elle ne prend pas ce qui traîne. »</w:t>
       </w:r>
     </w:p>
     <w:p>
@@ -5129,7 +5129,7 @@
     </w:p>
     <w:p>
       <w:r>
-        <w:t xml:space="preserve">« J’y ai prêté attention deux fois, ai-je dit, et j’ai vu son nom, parce que j’étais partie pour le trouver. »</w:t>
+        <w:t xml:space="preserve">« Moi, j’y ai prêté attention, ai-je dit, et j’ai vu son nom, parce que j’étais partie pour le trouver. »</w:t>
       </w:r>
     </w:p>
     <w:p>
@@ -5184,7 +5184,7 @@
     </w:p>
     <w:p>
       <w:r>
-        <w:t xml:space="preserve">« Je n’en ai fait aucun cas. Un chauffeur qui s’arrête pour piquer un somme. Mais Pete connaît chaque camion qui entre dans cette cour, et il a affirmé que ce n’était pas celle du livreur de viande, et moi, j’ai compris : celle de personne. » J’ai fait glisser mon doigt le long de la cuillère vers le poivrier. « Et la silhouette de Danny. Mince et rapide, au seuil de Greta avant que ses fours ne soient allumés, et filant vers le bout. Moi, j’ai entendu : la boutique dorée. Il n’a jamais dit qu’elle menait chez Sugarplum. Il a dit le bout. C’est moi qui y ai collé la boutique. »</w:t>
+        <w:t xml:space="preserve">« Je n’en ai fait aucun cas. Un chauffeur qui s’arrête pour piquer un somme. Mais Pete connaît chaque camion qui entre dans cette cour, et il a affirmé que ce n’était pas celle du livreur de viande, et moi, j’ai compris : celle de personne. » J’ai fait glisser mon doigt le long de la cuillère vers le poivrier. « Et la silhouette de Danny. Mince et rapide, au seuil de Greta avant que ses fours ne soient allumés, et filant vers le bout. Moi, j’ai entendu : la boutique dorée. Il n’a jamais dit qu’elle était entrée chez Sugarplum. Il a dit le bout. C’est moi qui y ai collé la boutique. »</w:t>
       </w:r>
     </w:p>
     <w:p>
@@ -5377,7 +5377,7 @@
     <w:p/>
     <w:p>
       <w:r>
-        <w:t xml:space="preserve">Je pouvais voir ce comptoir. Je pouvais le voir au matin de la vitre brisée, avec le nettoyage qui se faisait autour et le carnet de commandes posé ouvert sous la lampe, et Joyce Wendt sur le tabouret à côté de ce carnet, mince et vive dans sa veste blanche de boulangère, ses lunettes de lecture sur le nez, son téléphone à la main. En train de répondre à son livreur, avait-elle dit. Elle s’était assise là pendant que Greta préparait le thé.</w:t>
+        <w:t xml:space="preserve">Je pouvais voir ce comptoir. Je pouvais le voir au matin de la vitre brisée, avec le nettoyage qui se faisait autour et le carnet de commandes posé ouvert sous la lampe, et Joyce Wendt sur le tabouret à côté de ce carnet, mince et vive dans sa blouse blanche de boulangère, ses lunettes de lecture sur le nez, son téléphone à la main. En train de répondre à son livreur, avait-elle dit. Elle s’était assise là pendant que Greta préparait le thé.</w:t>
       </w:r>
     </w:p>
     <w:p/>
@@ -5497,7 +5497,7 @@
     <w:p/>
     <w:p>
       <w:r>
-        <w:t xml:space="preserve">« Qui les a appelés ? a-t-elle demandé. »</w:t>
+        <w:t xml:space="preserve">« Qui les a appelées ? a-t-elle demandé. »</w:t>
       </w:r>
     </w:p>
     <w:p/>
@@ -5593,7 +5593,7 @@
     <w:p/>
     <w:p>
       <w:r>
-        <w:t xml:space="preserve">« Que nous étions trop vieilles pour faire durer la brouille. » Elle s’est arrêtée et a avalé sa salive avant de pouvoir poursuivre. « Elle m’a apporté un gratin de nouilles au thon lundi. Celles de sa mère. Avec des petits pois dedans, et des chips écrasées sur le dessus. Je n’en avais pas goûté depuis qu’elle était partie. Je suis restée plantée là juste après son départ et j’en ai mangé la moitié à même le plat en pleurant dedans comme une idiote, et je l’ai lavé hier soir pour le poser près de la porte et le lui rapporter. » Elle n’a pas regardé le plat. « J’allais l’apporter moi-même à Bridgton en voiture. J’allais frapper à sa porte. »</w:t>
+        <w:t xml:space="preserve">« Que nous étions trop vieilles pour faire durer la brouille. » Elle s’est arrêtée et a avalé sa salive avant de pouvoir poursuivre. « Elle m’a apporté un gratin de nouilles au thon lundi. La recette de sa mère. Avec des petits pois dedans, et des chips écrasées sur le dessus. Je n’en avais pas goûté depuis qu’elle était partie. Je suis restée plantée là juste après son départ et j’en ai mangé la moitié à même le plat en pleurant dedans comme une idiote, et je l’ai lavé hier soir pour le poser près de la porte et le lui rapporter. » Elle n’a pas regardé le plat. « J’allais l’apporter moi-même à Bridgton en voiture. J’allais frapper à sa porte. »</w:t>
       </w:r>
     </w:p>
     <w:p/>
@@ -5605,7 +5605,7 @@
     <w:p/>
     <w:p>
       <w:r>
-        <w:t xml:space="preserve">« J’avais vingt-trois ans, a repris Greta. Joyce n’était guère plus âgée. Nous deux, avec les recettes de ma mère et un prêt de l’oncle de Joyce et ce bâtiment avec un toit qui fuyait au-dessus de l’étuve. Elle faisait le pain et je faisais les pâtisseries. Elle a toujours été meilleure que moi pour le pain. Je ne le lui ai jamais dit. J’aurais dû le lui dire. » Elle a tourné une page du carnet de commandes avant de la ramener en arrière. « Quinze ans. J’ai assisté à son mariage. Elle a tenu mon premier bébé avant qu’Harold ne le fasse, parce qu’Harold était sur le parking en train de vomir. Toutes ces années dans cette cuisine, à quatre heures du matin tous les matins, et puis l’argent et les avocats, et le nom au-dessus de la porte, et… » Elle s’est interrompue. « Et la tarte. Tout le monde dans deux comtés a entendu parler de la tarte. Je ne vais pas parler de la tarte. »</w:t>
+        <w:t xml:space="preserve">« J’avais vingt-trois ans, a repris Greta. Joyce n’était guère plus âgée. Nous deux, avec les recettes de ma mère et un prêt de l’oncle de Joyce et ce bâtiment avec un toit qui fuyait au-dessus de l’étuve. Elle faisait le pain et je faisais les douceurs. Elle a toujours été meilleure que moi pour le pain. Je ne le lui ai jamais dit. J’aurais dû le lui dire. » Elle a tourné une page du carnet de commandes avant de la ramener en arrière. « Quinze ans. J’ai assisté à son mariage. Elle a tenu mon premier bébé avant qu’Harold ne le fasse, parce qu’Harold était sur le parking en train de vomir. Toutes ces années dans cette cuisine, à quatre heures du matin tous les matins, et puis l’argent et les avocats, et le nom au-dessus de la porte, et… » Elle s’est interrompue. « Et la tarte. Tout le monde dans deux comtés a entendu parler de la tarte. Je ne vais pas parler de la tarte. »</w:t>
       </w:r>
     </w:p>
     <w:p/>
@@ -6479,7 +6479,7 @@
     <w:p/>
     <w:p>
       <w:r>
-        <w:t xml:space="preserve">La chef Tanaka avait préparé la pièce elle-même, non pas le bureau de devant avec son comptoir, mais la pièce calme située juste derrière, avec une table ordinaire et de bonnes chaises. La bouilloire cabossée avait été apportée et mise à chauffer dans le coin, si bien que l’air était chargé de vapeur. Tanaka s’est assise en bout de table, son carnet usé bien carré devant elle et un dossier marron glissé dessous. Greta s’était assise à côté de moi, bien droite dans son beau manteau. Elle était venue pour regarder Joyce, et elle la regardait. Pip se tenait contre ma botte sous la table, car je n’avais pas demandé la permission d’emmener l’oiseau et personne n’avait songé à lui refuser.</w:t>
+        <w:t xml:space="preserve">La chef Tanaka avait préparé la pièce elle-même, non pas le bureau de devant avec son comptoir, mais la pièce calme située juste derrière, avec une table ordinaire et de bonnes chaises. La bouilloire cabossée avait été apportée et mise à chauffer dans le coin, si bien que l’air était chargé de vapeur. Tanaka s’est assise en bout de table, son carnet usé bien carré devant elle et un dossier marron glissé dessous. Greta s’était assise à côté de moi, bien droite dans son beau manteau. Elle était venue pour regarder Joyce, et elle la regardait. Pip se tenait contre ma botte sous la table, car je n’avais pas demandé la permission d’emmener l’oiseau et personne n’avait songé à me l’interdire.</w:t>
       </w:r>
     </w:p>
     <w:p/>
@@ -6503,7 +6503,7 @@
     <w:p/>
     <w:p>
       <w:r>
-        <w:t xml:space="preserve">« Tout ce que je peux faire, a-t-elle dit en ouvrant sa parka. Je le pense sincèrement. Je suis venue pour l’aider. J’essaie de l’aider depuis deux semaines, si seulement elle voulait bien écouter quelqu’un. » Elle a posé ses clés sur la table à côté du sac, un lourd anneau de laiton et d’acier où figurait la clé de la camionnette.</w:t>
+        <w:t xml:space="preserve">« Tout ce que je peux faire, a-t-elle dit en ouvrant sa parka. Je le pense sincèrement. Je suis venue pour l’aider. J’essaie de l’aider depuis deux semaines, si seulement elle laissait quelqu’un le faire. » Elle a posé ses clés sur la table à côté du sac, un lourd anneau de laiton et d’acier où figurait la clé de la camionnette.</w:t>
       </w:r>
     </w:p>
     <w:p/>
@@ -6701,7 +6701,7 @@
     <w:p/>
     <w:p>
       <w:r>
-        <w:t xml:space="preserve">« C’était à nous. » Joyce a posé sa paume à plat sur la table. « Et puis c’est devenu le tien. »</w:t>
+        <w:t xml:space="preserve">« C’était à nous. » Joyce a posé sa paume à plat sur la table. « Et puis c’est devenu à toi. »</w:t>
       </w:r>
     </w:p>
     <w:p/>
@@ -6737,7 +6737,7 @@
     <w:p/>
     <w:p>
       <w:r>
-        <w:t xml:space="preserve">« Et tu m’as laissée croire que c’étaient mes mains qui me lâchaient. » La voix de Greta s’est radoucie. « Quatre fournées. Je suis restée plantée dans ma cuisine à me dire : Greta, c’est fini, tes mains ont perdu le tour et tu es trop vieille pour t’en rendre compte. Tu savais que je penserais ça. Tu me connaissais depuis quinze ans. Tu savais que c’était la seule chose que j’aurais pu croire. »</w:t>
+        <w:t xml:space="preserve">« Et tu m’as laissée croire que c’étaient mes mains qui me lâchaient. » La voix de Greta s’est radoucie. « Quatre fournées. Je suis restée plantée dans ma cuisine à me dire : Greta, c’est fini, tes mains ont perdu le tour et tu es trop vieille pour t’en rendre compte. Tu savais que je penserais ça. Tu m'as connue pendant quinze ans. Tu savais que c’était la seule chose que j’aurais pu croire. »</w:t>
       </w:r>
     </w:p>
     <w:p/>
@@ -6857,7 +6857,7 @@
         <w:t xml:space="preserve"/>
       </w:r>
       <w:r>
-        <w:t xml:space="preserve"> a reculé hors du parking avant de virer en direction de la route. Greta l’a suivie des yeux jusqu’au coin de la rue. Puis elle a ramassé la petite clé en laiton qu’elle avait fait tailler pour Joyce l’année de leur ouverture, l’a gardée un instant au creux de sa main avant de la glisser dans la poche de son manteau, dont elle a boutonné le rabat par-dessus.</w:t>
+        <w:t xml:space="preserve"> a reculé hors du parking avant de prendre la route du retour. Greta l’a suivie des yeux jusqu’au coin de la rue. Puis elle a ramassé la petite clé en laiton qu’elle avait fait tailler pour Joyce l’année de leur ouverture, l’a gardée un instant au creux de sa main avant de la glisser dans la poche de son manteau, dont elle a boutonné le rabat par-dessus.</w:t>
       </w:r>
     </w:p>
     <w:p>
@@ -7161,7 +7161,7 @@
     <w:p/>
     <w:p>
       <w:r>
-        <w:t xml:space="preserve">Il est revenu de la même façon simple, la sacoche plate en cuir sous le bras, avec son manteau de comté ordinaire. Mais une fois devant la porte du Holly Jolly, il affichait une assurance qu’il n’avait pas eue la première fois, celle d’un homme heureux pour une fois d’avoir été mandaté. Tanaka avait apporté le bocal et la fausse plainte au comté, et les employés sur place avaient vu quel esprit tordu avait tripoté leurs papiers et avaient défait les nœuds un par un. L’arrêté provisoire avait été annulé. Il devait de toute façon repasser dans la semaine pour sa nouvelle inspection. La pièce pour le lave-mains était arrivée le matin même, et Tom l’avait installée avant son arrivée. Les trois points d’usure de la cuisine de Greta étaient les mêmes que connaissait toute vieille cuisine de l’avenue, et ils n’étaient plus un problème. Varney s’est planté sur le pas de sa porte pour le lui dire, à haute voix, alors que la boutique était à moitié pleine de gens venus assister à la scène.</w:t>
+        <w:t xml:space="preserve">Il est revenu de la même façon simple, la sacoche plate en cuir sous le bras, avec son manteau de comté ordinaire. Mais une fois devant la porte du Holly Jolly, il affichait une assurance qu’il n’avait pas eue la première fois, celle d’un homme heureux pour une fois d’avoir été mandaté. Tanaka avait apporté le bocal et la fausse plainte au comté, et les employés sur place avaient vu ce qu'une main habile avait fait de leurs papiers et avaient défait les nœuds un par un. L’arrêté provisoire avait été annulé. Il devait de toute façon repasser dans la semaine pour sa nouvelle inspection. La pièce pour le lave-mains était arrivée le matin même, et Tom l’avait installée avant son arrivée. Les trois points d’usure de la cuisine de Greta étaient les mêmes que connaissait toute vieille cuisine de l’avenue, et ils n’étaient plus un problème. Varney s’est planté sur le pas de sa porte pour le lui dire, à haute voix, alors que la boutique était à moitié pleine de gens venus assister à la scène.</w:t>
       </w:r>
     </w:p>
     <w:p/>
@@ -7423,7 +7423,7 @@
     </w:p>
     <w:p>
       <w:r>
-        <w:t xml:space="preserve">Il y avait un bocal sur le comptoir de Kelly au Starlight qui se remplissait depuis que la collecte de nourriture avait commencé. Des pièces de monnaie pour la plupart. Un billet plié de temps en temps. Il y avait de l’argent de Greta, tiré de la caisse de la veille, bien qu’elle eût gardé ce dont la saison avait besoin et qu’elle n’eût pas voulu entendre un seul mot sur l’idée de donner davantage. La collecte pour la capsule en a rapporté un peu aussi. Les gens qui avaient transporté leurs restes jusqu’à la boîte en cèdre voulaient que le bâtiment reste debout pour les abriter, et ils ont fouillé dans leurs poches pour cela. Le cercle avait organisé une tombola. Martha avait vendu un quilt qu’elle avait eu l’intention de garder.</w:t>
+        <w:t xml:space="preserve">Il y avait un bocal sur le comptoir de Kelly au Starlight qui se remplissait depuis que la collecte de nourriture avait commencé. Des pièces de monnaie pour la plupart. Un billet plié de temps en temps. Il y avait de l’argent de Greta, tiré de la caisse de la veille, bien qu’elle eût gardé ce dont la saison avait besoin et qu’elle n’eût pas voulu entendre un seul mot sur l’idée de donner davantage. La collecte pour la capsule en a rapporté un peu aussi. Les gens qui avaient apporté leurs petits riens jusqu’à la boîte en cèdre voulaient que le bâtiment reste debout pour les abriter, et ils ont fouillé dans leurs poches pour cela. Le cercle avait organisé une tombola. Martha avait vendu un quilt qu’elle avait eu l’intention de garder.</w:t>
       </w:r>
     </w:p>
     <w:p>
@@ -7448,7 +7448,7 @@
     </w:p>
     <w:p>
       <w:r>
-        <w:t xml:space="preserve">J’ai mis le mien dans la boîte et je ne l’ai pas compté là où tout le monde pouvait voir.</w:t>
+        <w:t xml:space="preserve">J’ai mis ma part dans la boîte et je ne l’ai pas comptée là où tout le monde pouvait voir.</w:t>
       </w:r>
     </w:p>
     <w:p>
@@ -7685,12 +7685,12 @@
         <w:t xml:space="preserve"/>
       </w:r>
       <w:r>
-        <w:t xml:space="preserve"> Sam Patel, remonté de la cave dans son tablier noirci, a aidé Hal à porter le tout vers la vitrine. Ils l’ont posée à côté de l’ancienne, et les deux sont restées côte à côte derrière le verre, l’une pleine et en attente, l’autre encore à ouvrir.</w:t>
-      </w:r>
-    </w:p>
-    <w:p>
-      <w:r>
-        <w:t xml:space="preserve">Dehors, chaque bonhomme de neige de l’avenue se tenait en rang à travers le parc et le long de l’allée, tourné vers les fenêtres éclairées, des dizaines, alors que les enfants n’en avaient fait qu’une poignée. Du givre avait poussé sur les vitres en fougères et en étoiles pendant que nous remplissions la boîte. À l’autre bout de la pièce, Nick est resté immobile, une main dérivant vers la poche de sa poitrine où la petite pièce chaude avait voyagé toute la journée. Je n’avais pas besoin de demander ce qui l’avait attiré.</w:t>
+        <w:t xml:space="preserve"> Sam Patel, remonté de la cave dans son tablier noirci, a aidé Hal à porter la boîte jusqu'à la vitrine. Ils l’ont posée à côté de l’ancienne, et les deux sont restées côte à côte derrière le verre, l’une pleine et en attente, l’autre encore à ouvrir.</w:t>
+      </w:r>
+    </w:p>
+    <w:p>
+      <w:r>
+        <w:t xml:space="preserve">Dehors, chaque bonhomme de neige de l’avenue se tenait en rang à travers le parc et le long de l’allée, tourné vers les fenêtres éclairées, des dizaines, alors que les enfants n’en avaient fait qu’une poignée. Du givre avait poussé sur les vitres en fougères et en étoiles pendant que nous remplissions la boîte. À l’autre bout de la pièce, Nick est resté immobile, une main dérivant vers la poche de sa poitrine où la petite pièce chaude avait voyagé toute la journée. Je n’avais pas besoin de demander ce qui les avait attirés.</w:t>
       </w:r>
     </w:p>
     <w:p>
@@ -7812,7 +7812,7 @@
     <w:p/>
     <w:p>
       <w:r>
-        <w:t xml:space="preserve">Depuis le départ de Joyce, les seuls échanges entre elles s’étaient résumés à une mise en demeure d’avocat que Greta avait déchirée et à une plainte dactylographiée adressée au comté. Rien de tout cela n’avait raccommodé quoi que ce soit.</w:t>
+        <w:t xml:space="preserve">Depuis le départ de Joyce, les seuls échanges entre elles s’étaient résumés à une lettre d’avocat que Greta avait déchirée et à une plainte dactylographiée adressée au comté. Rien de tout cela n’avait raccommodé quoi que ce soit.</w:t>
       </w:r>
     </w:p>
     <w:p/>

</xml_diff>